<commit_message>
LaTeX clean-up and repeated-step removal applied to the final slide data whatever path built it (AI visuals, explainers); speaker script rebuilt
</commit_message>
<xml_diff>
--- a/docs/review/Learnova_Speaker_Script.docx
+++ b/docs/review/Learnova_Speaker_Script.docx
@@ -629,6 +629,12 @@
         <w:pStyle w:val="BodyText"/>
       </w:pPr>
       <w:r>
+        <w:t xml:space="preserve">Algorithms and equations are kept whole: pseudocode goes into one numbered panel with its indentation, and equations are written as real PowerPoint equations, the way Word shows them, not as plain text.</w:t>
+      </w:r>
+      <w:r>
+        <w:t xml:space="preserve"> </w:t>
+      </w:r>
+      <w:r>
         <w:rPr>
           <w:b/>
           <w:bCs/>
@@ -924,7 +930,7 @@
         <w:t xml:space="preserve">educational</w:t>
       </w:r>
       <w:r>
-        <w:t xml:space="preserve">, because each slide has one idea and a picture, and hard topics have labs;</w:t>
+        <w:t xml:space="preserve">, because each slide has one idea and a picture, and hard topics have labs, with a short quiz every four slides so students stay active;</w:t>
       </w:r>
       <w:r>
         <w:t xml:space="preserve"> </w:t>
@@ -1742,7 +1748,7 @@
     <w:name w:val="Normal"/>
     <w:qFormat/>
     <w:pPr>
-      <w:spacing w:after="120" w:line="360" w:lineRule="auto"/>
+      <w:spacing w:after="80" w:line="264" w:lineRule="auto"/>
       <w:jc w:val="both"/>
     </w:pPr>
     <w:rPr>
@@ -1756,7 +1762,7 @@
     <w:link w:val="BodyTextChar"/>
     <w:qFormat/>
     <w:pPr>
-      <w:spacing w:after="120" w:before="180" w:line="360" w:lineRule="auto"/>
+      <w:spacing w:after="80" w:before="180" w:line="264" w:lineRule="auto"/>
       <w:jc w:val="both"/>
     </w:pPr>
     <w:rPr>
@@ -1770,7 +1776,7 @@
     <w:next w:val="BodyText"/>
     <w:qFormat/>
     <w:pPr>
-      <w:spacing w:after="120" w:line="360" w:lineRule="auto"/>
+      <w:spacing w:after="80" w:line="264" w:lineRule="auto"/>
       <w:jc w:val="both"/>
     </w:pPr>
     <w:rPr>
@@ -1783,7 +1789,7 @@
     <w:basedOn w:val="BodyText"/>
     <w:qFormat/>
     <w:pPr>
-      <w:spacing w:after="120" w:before="36" w:line="360" w:lineRule="auto"/>
+      <w:spacing w:after="80" w:before="36" w:line="264" w:lineRule="auto"/>
       <w:jc w:val="both"/>
     </w:pPr>
     <w:rPr>
@@ -1949,7 +1955,8 @@
     <w:pPr>
       <w:keepNext/>
       <w:keepLines/>
-      <w:spacing w:after="80" w:before="360"/>
+      <w:pageBreakBefore w:val="0"/>
+      <w:spacing w:after="80" w:before="200"/>
       <w:outlineLvl w:val="0"/>
     </w:pPr>
     <w:rPr>
@@ -1973,7 +1980,8 @@
     <w:pPr>
       <w:keepNext/>
       <w:keepLines/>
-      <w:spacing w:after="80" w:before="160"/>
+      <w:pageBreakBefore w:val="0"/>
+      <w:spacing w:after="80" w:before="200"/>
       <w:outlineLvl w:val="1"/>
     </w:pPr>
     <w:rPr>
@@ -1997,7 +2005,8 @@
     <w:pPr>
       <w:keepNext/>
       <w:keepLines/>
-      <w:spacing w:after="80" w:before="160"/>
+      <w:pageBreakBefore w:val="0"/>
+      <w:spacing w:after="80" w:before="200"/>
       <w:outlineLvl w:val="2"/>
     </w:pPr>
     <w:rPr>

</xml_diff>